<commit_message>
updating logs and reserch docs
</commit_message>
<xml_diff>
--- a/02_Log_Sheets/Log1.docx
+++ b/02_Log_Sheets/Log1.docx
@@ -263,23 +263,31 @@
           <w:b/>
           <w:sz w:val="24"/>
         </w:rPr>
-        <w:tab/>
-      </w:r>
-      <w:r>
-        <w:rPr>
-          <w:rFonts w:ascii="Arial" w:hAnsi="Arial" w:cs="Arial"/>
-          <w:b/>
-          <w:sz w:val="24"/>
-        </w:rPr>
-        <w:tab/>
-      </w:r>
-      <w:r>
-        <w:rPr>
-          <w:rFonts w:ascii="Arial" w:hAnsi="Arial" w:cs="Arial"/>
-          <w:b/>
-          <w:sz w:val="24"/>
-        </w:rPr>
-        <w:t xml:space="preserve">    </w:t>
+        <w:t xml:space="preserve"> </w:t>
+      </w:r>
+      <w:r>
+        <w:rPr>
+          <w:rFonts w:ascii="Arial" w:hAnsi="Arial" w:cs="Arial"/>
+          <w:b/>
+          <w:sz w:val="24"/>
+        </w:rPr>
+        <w:t xml:space="preserve">                     </w:t>
+      </w:r>
+      <w:r>
+        <w:rPr>
+          <w:rFonts w:ascii="Arial" w:hAnsi="Arial" w:cs="Arial"/>
+          <w:b/>
+          <w:sz w:val="24"/>
+        </w:rPr>
+        <w:t xml:space="preserve"> </w:t>
+      </w:r>
+      <w:r>
+        <w:rPr>
+          <w:rFonts w:ascii="Arial" w:hAnsi="Arial" w:cs="Arial"/>
+          <w:b/>
+          <w:sz w:val="24"/>
+        </w:rPr>
+        <w:t xml:space="preserve">Last </w:t>
       </w:r>
       <w:r>
         <w:rPr>
@@ -288,14 +296,6 @@
           <w:sz w:val="24"/>
         </w:rPr>
         <w:t xml:space="preserve">Visit Date: </w:t>
-      </w:r>
-      <w:r>
-        <w:rPr>
-          <w:rFonts w:ascii="Arial" w:hAnsi="Arial" w:cs="Arial"/>
-          <w:b/>
-          <w:sz w:val="24"/>
-        </w:rPr>
-        <w:t>2025/11/2</w:t>
       </w:r>
     </w:p>
     <w:p>
@@ -532,14 +532,6 @@
     </w:p>
     <w:p>
       <w:pPr>
-        <w:rPr>
-          <w:rFonts w:ascii="Arial" w:hAnsi="Arial" w:cs="Arial"/>
-          <w:sz w:val="24"/>
-        </w:rPr>
-      </w:pPr>
-    </w:p>
-    <w:p>
-      <w:pPr>
         <w:pStyle w:val="ListParagraph"/>
         <w:numPr>
           <w:ilvl w:val="0"/>
@@ -557,25 +549,7 @@
           <w:sz w:val="24"/>
           <w:lang w:val="en-US"/>
         </w:rPr>
-        <w:t xml:space="preserve">Overview of the </w:t>
-      </w:r>
-      <w:proofErr w:type="spellStart"/>
-      <w:r>
-        <w:rPr>
-          <w:rFonts w:ascii="Arial" w:hAnsi="Arial" w:cs="Arial"/>
-          <w:sz w:val="24"/>
-          <w:lang w:val="en-US"/>
-        </w:rPr>
-        <w:t>HeartWay</w:t>
-      </w:r>
-      <w:proofErr w:type="spellEnd"/>
-      <w:r>
-        <w:rPr>
-          <w:rFonts w:ascii="Arial" w:hAnsi="Arial" w:cs="Arial"/>
-          <w:sz w:val="24"/>
-          <w:lang w:val="en-US"/>
-        </w:rPr>
-        <w:t xml:space="preserve"> project objectives and proposed architecture.</w:t>
+        <w:t>Overview of the HeartWay project objectives and proposed architecture.</w:t>
       </w:r>
     </w:p>
     <w:p>
@@ -619,7 +593,23 @@
           <w:sz w:val="24"/>
           <w:lang w:val="en-US"/>
         </w:rPr>
-        <w:t>Repository setup process and branch naming conventions (Increment1, Increment2, etc.).</w:t>
+        <w:t>Repository setup process and branch naming conventions (</w:t>
+      </w:r>
+      <w:r>
+        <w:rPr>
+          <w:rFonts w:ascii="Arial" w:hAnsi="Arial" w:cs="Arial"/>
+          <w:sz w:val="24"/>
+          <w:lang w:val="en-US"/>
+        </w:rPr>
+        <w:t xml:space="preserve">main, </w:t>
+      </w:r>
+      <w:r>
+        <w:rPr>
+          <w:rFonts w:ascii="Arial" w:hAnsi="Arial" w:cs="Arial"/>
+          <w:sz w:val="24"/>
+          <w:lang w:val="en-US"/>
+        </w:rPr>
+        <w:t>Increment1, Increment2 etc.).</w:t>
       </w:r>
     </w:p>
     <w:p>
@@ -757,9 +747,26 @@
           <w:sz w:val="24"/>
           <w:lang w:val="en-US"/>
         </w:rPr>
-        <w:t>Successfully created private GitHub repository named “</w:t>
-      </w:r>
-      <w:proofErr w:type="spellStart"/>
+        <w:t xml:space="preserve">Successfully created </w:t>
+      </w:r>
+      <w:r>
+        <w:rPr>
+          <w:rFonts w:ascii="Arial" w:hAnsi="Arial" w:cs="Arial"/>
+          <w:bCs/>
+          <w:sz w:val="24"/>
+          <w:lang w:val="en-US"/>
+        </w:rPr>
+        <w:t>public</w:t>
+      </w:r>
+      <w:r>
+        <w:rPr>
+          <w:rFonts w:ascii="Arial" w:hAnsi="Arial" w:cs="Arial"/>
+          <w:bCs/>
+          <w:sz w:val="24"/>
+          <w:lang w:val="en-US"/>
+        </w:rPr>
+        <w:t xml:space="preserve"> GitHub repository named “</w:t>
+      </w:r>
       <w:r>
         <w:rPr>
           <w:rFonts w:ascii="Arial" w:hAnsi="Arial" w:cs="Arial"/>
@@ -776,17 +783,7 @@
           <w:sz w:val="24"/>
           <w:lang w:val="en-US"/>
         </w:rPr>
-        <w:t>_HeartWay</w:t>
-      </w:r>
-      <w:proofErr w:type="spellEnd"/>
-      <w:r>
-        <w:rPr>
-          <w:rFonts w:ascii="Arial" w:hAnsi="Arial" w:cs="Arial"/>
-          <w:bCs/>
-          <w:sz w:val="24"/>
-          <w:lang w:val="en-US"/>
-        </w:rPr>
-        <w:t>”.</w:t>
+        <w:t>_HeartWay”.</w:t>
       </w:r>
     </w:p>
     <w:p>
@@ -839,11 +836,7 @@
     </w:p>
     <w:p>
       <w:pPr>
-        <w:pStyle w:val="ListParagraph"/>
-        <w:numPr>
-          <w:ilvl w:val="1"/>
-          <w:numId w:val="3"/>
-        </w:numPr>
+        <w:ind w:left="360" w:firstLine="720"/>
         <w:rPr>
           <w:rFonts w:ascii="Arial" w:hAnsi="Arial" w:cs="Arial"/>
           <w:bCs/>
@@ -858,14 +851,18 @@
         </w:rPr>
         <w:t>01_Artifacts/</w:t>
       </w:r>
-    </w:p>
-    <w:p>
-      <w:pPr>
-        <w:pStyle w:val="ListParagraph"/>
-        <w:numPr>
-          <w:ilvl w:val="1"/>
-          <w:numId w:val="3"/>
-        </w:numPr>
+      <w:r>
+        <w:rPr>
+          <w:rFonts w:ascii="Arial" w:hAnsi="Arial" w:cs="Arial"/>
+          <w:bCs/>
+          <w:sz w:val="24"/>
+        </w:rPr>
+        <w:t xml:space="preserve"> readme.md</w:t>
+      </w:r>
+    </w:p>
+    <w:p>
+      <w:pPr>
+        <w:ind w:left="360" w:firstLine="720"/>
         <w:rPr>
           <w:rFonts w:ascii="Arial" w:hAnsi="Arial" w:cs="Arial"/>
           <w:bCs/>
@@ -880,14 +877,18 @@
         </w:rPr>
         <w:t>02_Log_Sheets/</w:t>
       </w:r>
-    </w:p>
-    <w:p>
-      <w:pPr>
-        <w:pStyle w:val="ListParagraph"/>
-        <w:numPr>
-          <w:ilvl w:val="1"/>
-          <w:numId w:val="3"/>
-        </w:numPr>
+      <w:r>
+        <w:rPr>
+          <w:rFonts w:ascii="Arial" w:hAnsi="Arial" w:cs="Arial"/>
+          <w:bCs/>
+          <w:sz w:val="24"/>
+        </w:rPr>
+        <w:t xml:space="preserve"> readme.md</w:t>
+      </w:r>
+    </w:p>
+    <w:p>
+      <w:pPr>
+        <w:ind w:left="360" w:firstLine="720"/>
         <w:rPr>
           <w:rFonts w:ascii="Arial" w:hAnsi="Arial" w:cs="Arial"/>
           <w:bCs/>
@@ -902,14 +903,18 @@
         </w:rPr>
         <w:t>03_Development/</w:t>
       </w:r>
-    </w:p>
-    <w:p>
-      <w:pPr>
-        <w:pStyle w:val="ListParagraph"/>
-        <w:numPr>
-          <w:ilvl w:val="1"/>
-          <w:numId w:val="3"/>
-        </w:numPr>
+      <w:r>
+        <w:rPr>
+          <w:rFonts w:ascii="Arial" w:hAnsi="Arial" w:cs="Arial"/>
+          <w:bCs/>
+          <w:sz w:val="24"/>
+        </w:rPr>
+        <w:t xml:space="preserve"> readme.md</w:t>
+      </w:r>
+    </w:p>
+    <w:p>
+      <w:pPr>
+        <w:ind w:left="360" w:firstLine="720"/>
         <w:rPr>
           <w:rFonts w:ascii="Arial" w:hAnsi="Arial" w:cs="Arial"/>
           <w:bCs/>
@@ -923,6 +928,14 @@
           <w:sz w:val="24"/>
         </w:rPr>
         <w:t>04_Reports/</w:t>
+      </w:r>
+      <w:r>
+        <w:rPr>
+          <w:rFonts w:ascii="Arial" w:hAnsi="Arial" w:cs="Arial"/>
+          <w:bCs/>
+          <w:sz w:val="24"/>
+        </w:rPr>
+        <w:t xml:space="preserve"> readme.md</w:t>
       </w:r>
     </w:p>
     <w:p>
@@ -994,27 +1007,7 @@
           <w:sz w:val="24"/>
           <w:lang w:val="en-US"/>
         </w:rPr>
-        <w:t>Created Trello board “</w:t>
-      </w:r>
-      <w:proofErr w:type="spellStart"/>
-      <w:r>
-        <w:rPr>
-          <w:rFonts w:ascii="Arial" w:hAnsi="Arial" w:cs="Arial"/>
-          <w:bCs/>
-          <w:sz w:val="24"/>
-          <w:lang w:val="en-US"/>
-        </w:rPr>
-        <w:t>PrasunPaudel_HeartWay</w:t>
-      </w:r>
-      <w:proofErr w:type="spellEnd"/>
-      <w:r>
-        <w:rPr>
-          <w:rFonts w:ascii="Arial" w:hAnsi="Arial" w:cs="Arial"/>
-          <w:bCs/>
-          <w:sz w:val="24"/>
-          <w:lang w:val="en-US"/>
-        </w:rPr>
-        <w:t>” and invited supervisor.</w:t>
+        <w:t>Created Trello board “PrasunPaudel_HeartWay” and invited supervisor.</w:t>
       </w:r>
     </w:p>
     <w:p>
@@ -1079,7 +1072,55 @@
           <w:bCs/>
           <w:sz w:val="24"/>
         </w:rPr>
-        <w:t>nly files are stored since folders just represent locations and need at least one file to appear.</w:t>
+        <w:t xml:space="preserve">nly files </w:t>
+      </w:r>
+      <w:r>
+        <w:rPr>
+          <w:rFonts w:ascii="Arial" w:hAnsi="Arial" w:cs="Arial"/>
+          <w:bCs/>
+          <w:sz w:val="24"/>
+        </w:rPr>
+        <w:t>we</w:t>
+      </w:r>
+      <w:r>
+        <w:rPr>
+          <w:rFonts w:ascii="Arial" w:hAnsi="Arial" w:cs="Arial"/>
+          <w:bCs/>
+          <w:sz w:val="24"/>
+        </w:rPr>
+        <w:t xml:space="preserve">re stored since folders just </w:t>
+      </w:r>
+      <w:r>
+        <w:rPr>
+          <w:rFonts w:ascii="Arial" w:hAnsi="Arial" w:cs="Arial"/>
+          <w:bCs/>
+          <w:sz w:val="24"/>
+        </w:rPr>
+        <w:t>represented</w:t>
+      </w:r>
+      <w:r>
+        <w:rPr>
+          <w:rFonts w:ascii="Arial" w:hAnsi="Arial" w:cs="Arial"/>
+          <w:bCs/>
+          <w:sz w:val="24"/>
+        </w:rPr>
+        <w:t xml:space="preserve"> locations and need</w:t>
+      </w:r>
+      <w:r>
+        <w:rPr>
+          <w:rFonts w:ascii="Arial" w:hAnsi="Arial" w:cs="Arial"/>
+          <w:bCs/>
+          <w:sz w:val="24"/>
+        </w:rPr>
+        <w:t>ed</w:t>
+      </w:r>
+      <w:r>
+        <w:rPr>
+          <w:rFonts w:ascii="Arial" w:hAnsi="Arial" w:cs="Arial"/>
+          <w:bCs/>
+          <w:sz w:val="24"/>
+        </w:rPr>
+        <w:t xml:space="preserve"> at least one file to appear.</w:t>
       </w:r>
     </w:p>
     <w:p>
@@ -1155,21 +1196,17 @@
           <w:sz w:val="24"/>
           <w:lang w:val="en-US"/>
         </w:rPr>
-        <w:t xml:space="preserve">Research and analyze five (5) similar applications or software related to </w:t>
-      </w:r>
-      <w:proofErr w:type="spellStart"/>
-      <w:r>
-        <w:rPr>
-          <w:rFonts w:ascii="Arial" w:hAnsi="Arial" w:cs="Arial"/>
-          <w:bCs/>
-          <w:i/>
-          <w:iCs/>
+        <w:t xml:space="preserve">Research and analyze five similar software related to </w:t>
+      </w:r>
+      <w:r>
+        <w:rPr>
+          <w:rFonts w:ascii="Arial" w:hAnsi="Arial" w:cs="Arial"/>
+          <w:bCs/>
           <w:sz w:val="24"/>
           <w:lang w:val="en-US"/>
         </w:rPr>
         <w:t>HeartWay’s</w:t>
       </w:r>
-      <w:proofErr w:type="spellEnd"/>
       <w:r>
         <w:rPr>
           <w:rFonts w:ascii="Arial" w:hAnsi="Arial" w:cs="Arial"/>
@@ -1188,24 +1225,95 @@
         </w:numPr>
         <w:rPr>
           <w:rFonts w:ascii="Arial" w:hAnsi="Arial" w:cs="Arial"/>
-          <w:bCs/>
-          <w:sz w:val="24"/>
-          <w:lang w:val="en-US"/>
-        </w:rPr>
-      </w:pPr>
-      <w:r>
-        <w:rPr>
-          <w:rFonts w:ascii="Arial" w:hAnsi="Arial" w:cs="Arial"/>
-          <w:bCs/>
-          <w:sz w:val="24"/>
-          <w:lang w:val="en-US"/>
-        </w:rPr>
-        <w:t>Note their main features, user flow, and unique UI patterns.</w:t>
-      </w:r>
-    </w:p>
-    <w:p>
-      <w:pPr>
-        <w:pStyle w:val="ListParagraph"/>
+          <w:b/>
+          <w:sz w:val="24"/>
+        </w:rPr>
+      </w:pPr>
+      <w:r>
+        <w:rPr>
+          <w:rFonts w:ascii="Arial" w:hAnsi="Arial" w:cs="Arial"/>
+          <w:bCs/>
+          <w:sz w:val="24"/>
+          <w:lang w:val="en-US"/>
+        </w:rPr>
+        <w:t>Note their main features, user flow, and unique UI patterns</w:t>
+      </w:r>
+      <w:r>
+        <w:rPr>
+          <w:rFonts w:ascii="Arial" w:hAnsi="Arial" w:cs="Arial"/>
+          <w:bCs/>
+          <w:sz w:val="24"/>
+          <w:lang w:val="en-US"/>
+        </w:rPr>
+        <w:t>:</w:t>
+      </w:r>
+    </w:p>
+    <w:p>
+      <w:pPr>
+        <w:numPr>
+          <w:ilvl w:val="1"/>
+          <w:numId w:val="8"/>
+        </w:numPr>
+        <w:rPr>
+          <w:rFonts w:ascii="Arial" w:hAnsi="Arial" w:cs="Arial"/>
+          <w:b/>
+          <w:sz w:val="24"/>
+        </w:rPr>
+      </w:pPr>
+      <w:r>
+        <w:rPr>
+          <w:rFonts w:ascii="Arial" w:hAnsi="Arial" w:cs="Arial"/>
+          <w:bCs/>
+          <w:sz w:val="24"/>
+          <w:lang w:val="en-US"/>
+        </w:rPr>
+        <w:t>Navigation system, View Layout, Color Theory</w:t>
+      </w:r>
+    </w:p>
+    <w:p>
+      <w:pPr>
+        <w:numPr>
+          <w:ilvl w:val="1"/>
+          <w:numId w:val="8"/>
+        </w:numPr>
+        <w:rPr>
+          <w:rFonts w:ascii="Arial" w:hAnsi="Arial" w:cs="Arial"/>
+          <w:b/>
+          <w:sz w:val="24"/>
+        </w:rPr>
+      </w:pPr>
+      <w:r>
+        <w:rPr>
+          <w:rFonts w:ascii="Arial" w:hAnsi="Arial" w:cs="Arial"/>
+          <w:bCs/>
+          <w:sz w:val="24"/>
+          <w:lang w:val="en-US"/>
+        </w:rPr>
+        <w:t xml:space="preserve">Framework through </w:t>
+      </w:r>
+      <w:proofErr w:type="spellStart"/>
+      <w:r>
+        <w:rPr>
+          <w:rFonts w:ascii="Arial" w:hAnsi="Arial" w:cs="Arial"/>
+          <w:bCs/>
+          <w:sz w:val="24"/>
+          <w:lang w:val="en-US"/>
+        </w:rPr>
+        <w:t>Wappalyzer</w:t>
+      </w:r>
+      <w:proofErr w:type="spellEnd"/>
+      <w:r>
+        <w:rPr>
+          <w:rFonts w:ascii="Arial" w:hAnsi="Arial" w:cs="Arial"/>
+          <w:bCs/>
+          <w:sz w:val="24"/>
+          <w:lang w:val="en-US"/>
+        </w:rPr>
+        <w:t xml:space="preserve"> or similar tool</w:t>
+      </w:r>
+    </w:p>
+    <w:p>
+      <w:pPr>
         <w:numPr>
           <w:ilvl w:val="0"/>
           <w:numId w:val="8"/>
@@ -1214,73 +1322,31 @@
           <w:rFonts w:ascii="Arial" w:hAnsi="Arial" w:cs="Arial"/>
           <w:bCs/>
           <w:sz w:val="24"/>
-          <w:lang w:val="en-US"/>
-        </w:rPr>
-      </w:pPr>
-      <w:r>
-        <w:rPr>
-          <w:rFonts w:ascii="Arial" w:hAnsi="Arial" w:cs="Arial"/>
-          <w:bCs/>
-          <w:sz w:val="24"/>
-          <w:lang w:val="en-US"/>
-        </w:rPr>
-        <w:t xml:space="preserve">Prepare a color palette that represents the theme and emotion of </w:t>
-      </w:r>
-      <w:proofErr w:type="spellStart"/>
-      <w:r>
-        <w:rPr>
-          <w:rFonts w:ascii="Arial" w:hAnsi="Arial" w:cs="Arial"/>
-          <w:bCs/>
-          <w:i/>
-          <w:iCs/>
-          <w:sz w:val="24"/>
-          <w:lang w:val="en-US"/>
-        </w:rPr>
-        <w:t>HeartWay</w:t>
-      </w:r>
-      <w:proofErr w:type="spellEnd"/>
-      <w:r>
-        <w:rPr>
-          <w:rFonts w:ascii="Arial" w:hAnsi="Arial" w:cs="Arial"/>
-          <w:bCs/>
-          <w:sz w:val="24"/>
-          <w:lang w:val="en-US"/>
-        </w:rPr>
-        <w:t>.</w:t>
-      </w:r>
-    </w:p>
-    <w:p>
-      <w:pPr>
-        <w:rPr>
-          <w:rFonts w:ascii="Arial" w:hAnsi="Arial" w:cs="Arial"/>
-          <w:b/>
-          <w:sz w:val="24"/>
-        </w:rPr>
-      </w:pPr>
-    </w:p>
-    <w:p>
-      <w:pPr>
-        <w:rPr>
-          <w:rFonts w:ascii="Arial" w:hAnsi="Arial" w:cs="Arial"/>
-          <w:b/>
-          <w:sz w:val="24"/>
-        </w:rPr>
-      </w:pPr>
-    </w:p>
-    <w:p>
-      <w:pPr>
-        <w:rPr>
-          <w:rFonts w:ascii="Arial" w:hAnsi="Arial" w:cs="Arial"/>
-          <w:b/>
-          <w:sz w:val="24"/>
-        </w:rPr>
-      </w:pPr>
-    </w:p>
-    <w:p>
-      <w:pPr>
-        <w:rPr>
-          <w:rFonts w:ascii="Arial" w:hAnsi="Arial" w:cs="Arial"/>
-          <w:b/>
+        </w:rPr>
+      </w:pPr>
+      <w:r>
+        <w:rPr>
+          <w:rFonts w:ascii="Arial" w:hAnsi="Arial" w:cs="Arial"/>
+          <w:bCs/>
+          <w:sz w:val="24"/>
+        </w:rPr>
+        <w:t>Test and research how each components function.</w:t>
+      </w:r>
+    </w:p>
+    <w:p>
+      <w:pPr>
+        <w:rPr>
+          <w:rFonts w:ascii="Arial" w:hAnsi="Arial" w:cs="Arial"/>
+          <w:bCs/>
+          <w:sz w:val="24"/>
+        </w:rPr>
+      </w:pPr>
+    </w:p>
+    <w:p>
+      <w:pPr>
+        <w:rPr>
+          <w:rFonts w:ascii="Arial" w:hAnsi="Arial" w:cs="Arial"/>
+          <w:bCs/>
           <w:sz w:val="24"/>
         </w:rPr>
       </w:pPr>
@@ -1382,7 +1448,6 @@
           <w:b/>
           <w:sz w:val="24"/>
         </w:rPr>
-        <w:lastRenderedPageBreak/>
         <w:t>Prasun Paudel</w:t>
       </w:r>
       <w:r>
@@ -1721,8 +1786,8 @@
   <w:abstractNum w:abstractNumId="1" w15:restartNumberingAfterBreak="0">
     <w:nsid w:val="0E1869D0"/>
     <w:multiLevelType w:val="hybridMultilevel"/>
-    <w:tmpl w:val="252680D2"/>
-    <w:lvl w:ilvl="0" w:tplc="0409000F">
+    <w:tmpl w:val="B010F120"/>
+    <w:lvl w:ilvl="0" w:tplc="E4B695F8">
       <w:start w:val="1"/>
       <w:numFmt w:val="decimal"/>
       <w:lvlText w:val="%1."/>
@@ -1730,6 +1795,10 @@
       <w:pPr>
         <w:ind w:left="720" w:hanging="360"/>
       </w:pPr>
+      <w:rPr>
+        <w:b w:val="0"/>
+        <w:bCs/>
+      </w:rPr>
     </w:lvl>
     <w:lvl w:ilvl="1" w:tplc="04090019" w:tentative="1">
       <w:start w:val="1"/>
@@ -1807,8 +1876,8 @@
   <w:abstractNum w:abstractNumId="2" w15:restartNumberingAfterBreak="0">
     <w:nsid w:val="192543A9"/>
     <w:multiLevelType w:val="hybridMultilevel"/>
-    <w:tmpl w:val="F5AC5628"/>
-    <w:lvl w:ilvl="0" w:tplc="0409000F">
+    <w:tmpl w:val="025E3FB4"/>
+    <w:lvl w:ilvl="0" w:tplc="5DF4F50E">
       <w:start w:val="1"/>
       <w:numFmt w:val="decimal"/>
       <w:lvlText w:val="%1."/>
@@ -1816,8 +1885,12 @@
       <w:pPr>
         <w:ind w:left="720" w:hanging="360"/>
       </w:pPr>
-    </w:lvl>
-    <w:lvl w:ilvl="1" w:tplc="04090019" w:tentative="1">
+      <w:rPr>
+        <w:b w:val="0"/>
+        <w:bCs/>
+      </w:rPr>
+    </w:lvl>
+    <w:lvl w:ilvl="1" w:tplc="04090019">
       <w:start w:val="1"/>
       <w:numFmt w:val="lowerLetter"/>
       <w:lvlText w:val="%2."/>
@@ -3034,6 +3107,7 @@
   <w:style w:type="character" w:default="1" w:styleId="DefaultParagraphFont">
     <w:name w:val="Default Paragraph Font"/>
     <w:uiPriority w:val="1"/>
+    <w:semiHidden/>
     <w:unhideWhenUsed/>
   </w:style>
   <w:style w:type="table" w:default="1" w:styleId="TableNormal">
@@ -3750,14 +3824,6 @@
 </file>
 
 <file path=customXml/item1.xml><?xml version="1.0" encoding="utf-8"?>
-<p:properties xmlns:p="http://schemas.microsoft.com/office/2006/metadata/properties" xmlns:xsi="http://www.w3.org/2001/XMLSchema-instance" xmlns:pc="http://schemas.microsoft.com/office/infopath/2007/PartnerControls">
-  <documentManagement>
-    <_activity xmlns="34f18a80-e61c-4899-a25a-c14361ed5c08" xsi:nil="true"/>
-  </documentManagement>
-</p:properties>
-</file>
-
-<file path=customXml/item2.xml><?xml version="1.0" encoding="utf-8"?>
 <?mso-contentType ?>
 <FormTemplates xmlns="http://schemas.microsoft.com/sharepoint/v3/contenttype/forms">
   <Display>DocumentLibraryForm</Display>
@@ -3766,7 +3832,7 @@
 </FormTemplates>
 </file>
 
-<file path=customXml/item3.xml><?xml version="1.0" encoding="utf-8"?>
+<file path=customXml/item2.xml><?xml version="1.0" encoding="utf-8"?>
 <ct:contentTypeSchema xmlns:ct="http://schemas.microsoft.com/office/2006/metadata/contentType" xmlns:ma="http://schemas.microsoft.com/office/2006/metadata/properties/metaAttributes" ct:_="" ma:_="" ma:contentTypeName="Document" ma:contentTypeID="0x0101008ACF6DBD7A9C2E40A3032EFC7197D814" ma:contentTypeVersion="6" ma:contentTypeDescription="Create a new document." ma:contentTypeScope="" ma:versionID="05af1f1f8351f21fed42df03cc612b13">
   <xsd:schema xmlns:xsd="http://www.w3.org/2001/XMLSchema" xmlns:xs="http://www.w3.org/2001/XMLSchema" xmlns:p="http://schemas.microsoft.com/office/2006/metadata/properties" xmlns:ns3="34f18a80-e61c-4899-a25a-c14361ed5c08" targetNamespace="http://schemas.microsoft.com/office/2006/metadata/properties" ma:root="true" ma:fieldsID="48f492d4c529519ca453f20fb96938e7" ns3:_="">
     <xsd:import namespace="34f18a80-e61c-4899-a25a-c14361ed5c08"/>
@@ -3922,23 +3988,15 @@
 </ct:contentTypeSchema>
 </file>
 
-<file path=customXml/itemProps1.xml><?xml version="1.0" encoding="utf-8"?>
-<ds:datastoreItem xmlns:ds="http://schemas.openxmlformats.org/officeDocument/2006/customXml" ds:itemID="{E7BD5E57-EC11-4FEB-965F-E059F6BD17FA}">
-  <ds:schemaRefs>
-    <ds:schemaRef ds:uri="http://purl.org/dc/elements/1.1/"/>
-    <ds:schemaRef ds:uri="http://schemas.microsoft.com/office/2006/documentManagement/types"/>
-    <ds:schemaRef ds:uri="http://schemas.microsoft.com/office/2006/metadata/properties"/>
-    <ds:schemaRef ds:uri="http://purl.org/dc/terms/"/>
-    <ds:schemaRef ds:uri="http://schemas.microsoft.com/office/infopath/2007/PartnerControls"/>
-    <ds:schemaRef ds:uri="http://www.w3.org/XML/1998/namespace"/>
-    <ds:schemaRef ds:uri="http://schemas.openxmlformats.org/package/2006/metadata/core-properties"/>
-    <ds:schemaRef ds:uri="34f18a80-e61c-4899-a25a-c14361ed5c08"/>
-    <ds:schemaRef ds:uri="http://purl.org/dc/dcmitype/"/>
-  </ds:schemaRefs>
-</ds:datastoreItem>
+<file path=customXml/item3.xml><?xml version="1.0" encoding="utf-8"?>
+<p:properties xmlns:p="http://schemas.microsoft.com/office/2006/metadata/properties" xmlns:xsi="http://www.w3.org/2001/XMLSchema-instance" xmlns:pc="http://schemas.microsoft.com/office/infopath/2007/PartnerControls">
+  <documentManagement>
+    <_activity xmlns="34f18a80-e61c-4899-a25a-c14361ed5c08" xsi:nil="true"/>
+  </documentManagement>
+</p:properties>
 </file>
 
-<file path=customXml/itemProps2.xml><?xml version="1.0" encoding="utf-8"?>
+<file path=customXml/itemProps1.xml><?xml version="1.0" encoding="utf-8"?>
 <ds:datastoreItem xmlns:ds="http://schemas.openxmlformats.org/officeDocument/2006/customXml" ds:itemID="{58B68466-B50E-491F-B4B2-B2157E5F6A4D}">
   <ds:schemaRefs>
     <ds:schemaRef ds:uri="http://schemas.microsoft.com/sharepoint/v3/contenttype/forms"/>
@@ -3946,7 +4004,7 @@
 </ds:datastoreItem>
 </file>
 
-<file path=customXml/itemProps3.xml><?xml version="1.0" encoding="utf-8"?>
+<file path=customXml/itemProps2.xml><?xml version="1.0" encoding="utf-8"?>
 <ds:datastoreItem xmlns:ds="http://schemas.openxmlformats.org/officeDocument/2006/customXml" ds:itemID="{16B38739-B412-4EE3-BE5E-FFD88D99703C}">
   <ds:schemaRefs>
     <ds:schemaRef ds:uri="http://schemas.microsoft.com/office/2006/metadata/contentType"/>
@@ -3962,4 +4020,14 @@
     <ds:schemaRef ds:uri="http://schemas.microsoft.com/internal/obd"/>
   </ds:schemaRefs>
 </ds:datastoreItem>
+</file>
+
+<file path=customXml/itemProps3.xml><?xml version="1.0" encoding="utf-8"?>
+<ds:datastoreItem xmlns:ds="http://schemas.openxmlformats.org/officeDocument/2006/customXml" ds:itemID="{E7BD5E57-EC11-4FEB-965F-E059F6BD17FA}">
+  <ds:schemaRefs>
+    <ds:schemaRef ds:uri="http://schemas.microsoft.com/office/2006/metadata/properties"/>
+    <ds:schemaRef ds:uri="http://schemas.microsoft.com/office/infopath/2007/PartnerControls"/>
+    <ds:schemaRef ds:uri="34f18a80-e61c-4899-a25a-c14361ed5c08"/>
+  </ds:schemaRefs>
+</ds:datastoreItem>
 </file>
</xml_diff>